<commit_message>
Made some changes to how whiff works and UI updates
</commit_message>
<xml_diff>
--- a/Sumo Game Update.docx
+++ b/Sumo Game Update.docx
@@ -76,13 +76,7 @@
     </w:p>
     <w:p>
       <w:r>
-        <w:t>Movement has been impl</w:t>
-      </w:r>
-      <w:r>
-        <w:t>e</w:t>
-      </w:r>
-      <w:r>
-        <w:t xml:space="preserve">mented with vibe code and also mobile input work, but the movement feels off. currently the movement only works if both left and right is being held down but I </w:t>
+        <w:t xml:space="preserve">Movement has been implemented with vibe code and also mobile input work, but the movement feels off. currently the movement only works if both left and right is being held down but I </w:t>
       </w:r>
       <w:proofErr w:type="spellStart"/>
       <w:proofErr w:type="gramStart"/>
@@ -92,13 +86,7 @@
       <w:proofErr w:type="spellEnd"/>
       <w:proofErr w:type="gramEnd"/>
       <w:r>
-        <w:t xml:space="preserve"> really tell where </w:t>
-      </w:r>
-      <w:r>
-        <w:t>from</w:t>
-      </w:r>
-      <w:r>
-        <w:t xml:space="preserve"> facing is.</w:t>
+        <w:t xml:space="preserve"> really tell where from facing is.</w:t>
       </w:r>
     </w:p>
     <w:p>
@@ -114,25 +102,7 @@
     </w:p>
     <w:p>
       <w:r>
-        <w:t>The movement is not better to play with.</w:t>
-      </w:r>
-      <w:r>
-        <w:t xml:space="preserve"> </w:t>
-      </w:r>
-      <w:r>
-        <w:t>I a</w:t>
-      </w:r>
-      <w:r>
-        <w:t>l</w:t>
-      </w:r>
-      <w:r>
-        <w:t>s</w:t>
-      </w:r>
-      <w:r>
-        <w:t>o</w:t>
-      </w:r>
-      <w:r>
-        <w:t xml:space="preserve"> added a nose to the character to show which way it was facing.</w:t>
+        <w:t>The movement is not better to play with. I also added a nose to the character to show which way it was facing.</w:t>
       </w:r>
     </w:p>
     <w:p>
@@ -145,13 +115,7 @@
       </w:r>
       <w:proofErr w:type="spellEnd"/>
       <w:r>
-        <w:t xml:space="preserve"> can add powerups to change rotation or swap the controls over. now I want to work on the dodge and shove mechanic. I also want to see the capsul</w:t>
-      </w:r>
-      <w:r>
-        <w:t>e</w:t>
-      </w:r>
-      <w:r>
-        <w:t xml:space="preserve"> shoot out as a debug.</w:t>
+        <w:t xml:space="preserve"> can add powerups to change rotation or swap the controls over. now I want to work on the dodge and shove mechanic. I also want to see the capsule shoot out as a debug.</w:t>
       </w:r>
     </w:p>
     <w:p/>
@@ -162,19 +126,7 @@
     </w:p>
     <w:p>
       <w:r>
-        <w:t xml:space="preserve">I made the player dodge and shove system work. There were some issues but it was mainly with the input </w:t>
-      </w:r>
-      <w:r>
-        <w:t>management</w:t>
-      </w:r>
-      <w:r>
-        <w:t xml:space="preserve"> system. I am </w:t>
-      </w:r>
-      <w:r>
-        <w:t>curious</w:t>
-      </w:r>
-      <w:r>
-        <w:t xml:space="preserve"> to see what will happen if </w:t>
+        <w:t xml:space="preserve">I made the player dodge and shove system work. There were some issues but it was mainly with the input management system. I am curious to see what will happen if </w:t>
       </w:r>
       <w:proofErr w:type="spellStart"/>
       <w:r>
@@ -190,24 +142,12 @@
       </w:r>
       <w:proofErr w:type="gramEnd"/>
       <w:r>
-        <w:t xml:space="preserve"> shove each</w:t>
-      </w:r>
-      <w:r>
-        <w:t xml:space="preserve"> </w:t>
-      </w:r>
-      <w:r>
-        <w:t>other at the same time, if it will break the game</w:t>
-      </w:r>
-    </w:p>
-    <w:p>
-      <w:r>
-        <w:t xml:space="preserve">But now I will make the </w:t>
-      </w:r>
-      <w:r>
-        <w:t>boundary</w:t>
-      </w:r>
-      <w:r>
-        <w:t xml:space="preserve"> system for the game</w:t>
+        <w:t xml:space="preserve"> shove each other at the same time, if it will break the game</w:t>
+      </w:r>
+    </w:p>
+    <w:p>
+      <w:r>
+        <w:t>But now I will make the boundary system for the game</w:t>
       </w:r>
     </w:p>
     <w:p/>
@@ -216,97 +156,21 @@
         <w:t>Update 4</w:t>
       </w:r>
     </w:p>
-    <w:p>
-      <w:proofErr w:type="gramStart"/>
-      <w:r>
-        <w:t>.The</w:t>
-      </w:r>
-      <w:proofErr w:type="gramEnd"/>
-      <w:r>
-        <w:t xml:space="preserve"> game manager detects now when the player is </w:t>
-      </w:r>
-      <w:r>
-        <w:t>outside</w:t>
-      </w:r>
-      <w:r>
-        <w:t xml:space="preserve"> of the ring and will print a console line saying which player is out of the ring, now to implement the falling rings and a timer and a best of game mode.</w:t>
-      </w:r>
-    </w:p>
-    <w:p>
-      <w:proofErr w:type="gramStart"/>
-      <w:r>
-        <w:t>.I</w:t>
-      </w:r>
-      <w:proofErr w:type="gramEnd"/>
-      <w:r>
-        <w:t xml:space="preserve"> </w:t>
-      </w:r>
-      <w:r>
-        <w:t>don’t</w:t>
-      </w:r>
-      <w:r>
-        <w:t xml:space="preserve"> want the game to be over in just 1 round It takes away the fun from the game, so I </w:t>
-      </w:r>
-      <w:proofErr w:type="spellStart"/>
-      <w:r>
-        <w:t>wil</w:t>
-      </w:r>
-      <w:proofErr w:type="spellEnd"/>
-      <w:r>
-        <w:t xml:space="preserve"> be making a best of mode to extend the gameplay later but for now make the rounds playable public variable. </w:t>
-      </w:r>
-    </w:p>
-    <w:p>
-      <w:proofErr w:type="gramStart"/>
-      <w:r>
-        <w:lastRenderedPageBreak/>
-        <w:t>.I</w:t>
-      </w:r>
-      <w:proofErr w:type="gramEnd"/>
-      <w:r>
-        <w:t xml:space="preserve"> need the player spawn and timer system to work before I can make the falling rings work. The game flow will be </w:t>
-      </w:r>
-    </w:p>
-    <w:p>
-      <w:r>
-        <w:t xml:space="preserve"> 1.on press play in editor,</w:t>
-      </w:r>
-      <w:r>
-        <w:t xml:space="preserve"> </w:t>
-      </w:r>
-      <w:r>
-        <w:t>game boots into player select screen</w:t>
-      </w:r>
-    </w:p>
-    <w:p>
-      <w:r>
-        <w:t xml:space="preserve"> 2.select the number of players (Max 4 players on 1 </w:t>
-      </w:r>
-      <w:proofErr w:type="gramStart"/>
-      <w:r>
-        <w:t>screen{</w:t>
-      </w:r>
-      <w:proofErr w:type="gramEnd"/>
-      <w:r>
-        <w:t xml:space="preserve">buttons on the screen will show 1 to 4 to select the number of players}) to spawn. </w:t>
-      </w:r>
-    </w:p>
-    <w:p>
-      <w:r>
-        <w:t xml:space="preserve"> 3.game starts and players UI controls and the rings are spawned in (Players will be equidistant from each other).</w:t>
-      </w:r>
-    </w:p>
-    <w:p/>
     <w:p>
       <w:pPr>
         <w:pStyle w:val="ListParagraph"/>
         <w:numPr>
           <w:ilvl w:val="0"/>
-          <w:numId w:val="1"/>
+          <w:numId w:val="7"/>
         </w:numPr>
       </w:pPr>
-      <w:r>
-        <w:t>then the round will start and the players will have to try to push the opponents off the screen</w:t>
+      <w:proofErr w:type="gramStart"/>
+      <w:r>
+        <w:t>.The</w:t>
+      </w:r>
+      <w:proofErr w:type="gramEnd"/>
+      <w:r>
+        <w:t xml:space="preserve"> game manager detects now when the player is outside of the ring and will print a console line saying which player is out of the ring, now to implement the falling rings and a timer and a best of game mode.</w:t>
       </w:r>
     </w:p>
     <w:p>
@@ -314,23 +178,22 @@
         <w:pStyle w:val="ListParagraph"/>
         <w:numPr>
           <w:ilvl w:val="0"/>
-          <w:numId w:val="1"/>
+          <w:numId w:val="7"/>
         </w:numPr>
       </w:pPr>
-      <w:r>
-        <w:t xml:space="preserve">UI for the controls will be spawned on each of the corners of the phone (1 </w:t>
-      </w:r>
-      <w:r>
-        <w:t>corner</w:t>
-      </w:r>
-      <w:r>
-        <w:t xml:space="preserve"> of the device for each player, 4 player max) and the timer for the number of seconds will </w:t>
-      </w:r>
-      <w:r>
-        <w:t>start (</w:t>
-      </w:r>
-      <w:r>
-        <w:t>Timer is public variable).</w:t>
+      <w:proofErr w:type="gramStart"/>
+      <w:r>
+        <w:t>.I</w:t>
+      </w:r>
+      <w:proofErr w:type="gramEnd"/>
+      <w:r>
+        <w:t xml:space="preserve"> don’t want the game to be over in just 1 round It takes away the fun from the game, so I wi</w:t>
+      </w:r>
+      <w:r>
+        <w:t>l</w:t>
+      </w:r>
+      <w:r>
+        <w:t xml:space="preserve">l be making a best of mode to extend the gameplay later but for now make the rounds playable public variable. </w:t>
       </w:r>
     </w:p>
     <w:p>
@@ -338,14 +201,121 @@
         <w:pStyle w:val="ListParagraph"/>
         <w:numPr>
           <w:ilvl w:val="0"/>
-          <w:numId w:val="1"/>
+          <w:numId w:val="7"/>
         </w:numPr>
       </w:pPr>
-      <w:r>
-        <w:t>t</w:t>
-      </w:r>
-      <w:r>
-        <w:t xml:space="preserve">he timer will count down the seconds in the game as a UI of the screen and will stop if the player manages to push their opponent off the ring. if it is a tie by the time the timer goes off then the next round will start. this is when the </w:t>
+      <w:proofErr w:type="gramStart"/>
+      <w:r>
+        <w:t>.I</w:t>
+      </w:r>
+      <w:proofErr w:type="gramEnd"/>
+      <w:r>
+        <w:t xml:space="preserve"> need the player spawn and timer system to work before I can make the falling rings work. The game flow will be </w:t>
+      </w:r>
+    </w:p>
+    <w:p>
+      <w:r>
+        <w:t>1.on press play in editor, game boots into player select screen</w:t>
+      </w:r>
+    </w:p>
+    <w:p>
+      <w:r>
+        <w:t xml:space="preserve">2.select the number of players (Max 4 players on 1 </w:t>
+      </w:r>
+      <w:proofErr w:type="gramStart"/>
+      <w:r>
+        <w:t>screen{</w:t>
+      </w:r>
+      <w:proofErr w:type="gramEnd"/>
+      <w:r>
+        <w:t xml:space="preserve">buttons on the screen will show 1 to 4 to select the number of players}) to spawn. </w:t>
+      </w:r>
+    </w:p>
+    <w:p>
+      <w:r>
+        <w:t>3.game starts and players UI controls and the rings are spawned in (Players will be equidistant from each other).</w:t>
+      </w:r>
+    </w:p>
+    <w:p/>
+    <w:p>
+      <w:r>
+        <w:t>then the round will start and the players will have to try to push the opponents off the screen</w:t>
+      </w:r>
+    </w:p>
+    <w:p>
+      <w:r>
+        <w:t>UI for the controls will be spawned on each of the corners of the phone (1 corner of the device for each player, 4 player max) and the timer for the number of seconds will start (Timer is public variable).</w:t>
+      </w:r>
+    </w:p>
+    <w:p>
+      <w:r>
+        <w:t xml:space="preserve">the timer will count down the seconds in the game as a UI of the screen and will stop if the player manages to push their opponent off the ring. if it is a tie by the time the timer goes off then the next round will start. this is when the </w:t>
+      </w:r>
+    </w:p>
+    <w:p>
+      <w:r>
+        <w:t>rings disappear outer first-&gt; inner second.</w:t>
+      </w:r>
+    </w:p>
+    <w:p/>
+    <w:p>
+      <w:r>
+        <w:t>25/5</w:t>
+      </w:r>
+    </w:p>
+    <w:p>
+      <w:r>
+        <w:t>Update 5</w:t>
+      </w:r>
+    </w:p>
+    <w:p>
+      <w:r>
+        <w:t>Player spawn and UI spawn works. You can now choose the number of players to spawn but for now it is only one option (2 players).</w:t>
+      </w:r>
+    </w:p>
+    <w:p>
+      <w:r>
+        <w:t>The current issue is that the players are not being recognized as 2 separate entities on spawning and when one is shoved out of the map then the win condition does not trigger. NEED TO FIX ASAP</w:t>
+      </w:r>
+    </w:p>
+    <w:p/>
+    <w:p>
+      <w:r>
+        <w:t>27/5</w:t>
+      </w:r>
+    </w:p>
+    <w:p>
+      <w:r>
+        <w:t xml:space="preserve">The player spawn, UI and win conditions work, </w:t>
+      </w:r>
+      <w:proofErr w:type="spellStart"/>
+      <w:r>
+        <w:t>i</w:t>
+      </w:r>
+      <w:proofErr w:type="spellEnd"/>
+      <w:r>
+        <w:t xml:space="preserve"> also added different colours for the players so It will be easier to identify them, they have matching UI colours.</w:t>
+      </w:r>
+    </w:p>
+    <w:p>
+      <w:r>
+        <w:t>Now I need to add the multiple game modes and also 3 player, 4 player counts. then I can start tackling the powerups</w:t>
+      </w:r>
+    </w:p>
+    <w:p/>
+    <w:p>
+      <w:r>
+        <w:t>28/5</w:t>
+      </w:r>
+    </w:p>
+    <w:p>
+      <w:r>
+        <w:t>Update 7</w:t>
+      </w:r>
+    </w:p>
+    <w:p>
+      <w:r>
+        <w:t>Things that I have added</w:t>
       </w:r>
     </w:p>
     <w:p>
@@ -353,114 +323,11 @@
         <w:pStyle w:val="ListParagraph"/>
         <w:numPr>
           <w:ilvl w:val="0"/>
-          <w:numId w:val="1"/>
+          <w:numId w:val="6"/>
         </w:numPr>
       </w:pPr>
       <w:r>
-        <w:t xml:space="preserve">rings </w:t>
-      </w:r>
-      <w:r>
-        <w:t>disappear</w:t>
-      </w:r>
-      <w:r>
-        <w:t xml:space="preserve"> outer first-&gt; inner second.</w:t>
-      </w:r>
-    </w:p>
-    <w:p/>
-    <w:p>
-      <w:r>
-        <w:t>25/5</w:t>
-      </w:r>
-    </w:p>
-    <w:p>
-      <w:r>
-        <w:t>Update 5</w:t>
-      </w:r>
-    </w:p>
-    <w:p>
-      <w:r>
-        <w:t xml:space="preserve">Player spawn and UI spawn works. You can now choose the </w:t>
-      </w:r>
-      <w:r>
-        <w:t>number</w:t>
-      </w:r>
-      <w:r>
-        <w:t xml:space="preserve"> of players to spawn but for now it is only one option</w:t>
-      </w:r>
-      <w:r>
-        <w:t xml:space="preserve"> </w:t>
-      </w:r>
-      <w:r>
-        <w:t>(2 players).</w:t>
-      </w:r>
-    </w:p>
-    <w:p>
-      <w:r>
-        <w:t xml:space="preserve">The current issue is that the players are not being recognized as 2 </w:t>
-      </w:r>
-      <w:r>
-        <w:t>separate</w:t>
-      </w:r>
-      <w:r>
-        <w:t xml:space="preserve"> entities on spawning and when one is shoved out of the map then the win condition does not trigger. NEED TO FIX ASAP</w:t>
-      </w:r>
-    </w:p>
-    <w:p/>
-    <w:p>
-      <w:r>
-        <w:t>27/5</w:t>
-      </w:r>
-    </w:p>
-    <w:p>
-      <w:r>
-        <w:t>The player spawn, UI and win condi</w:t>
-      </w:r>
-      <w:r>
-        <w:t>t</w:t>
-      </w:r>
-      <w:r>
-        <w:t xml:space="preserve">ions work, </w:t>
-      </w:r>
-      <w:proofErr w:type="spellStart"/>
-      <w:r>
-        <w:t>i</w:t>
-      </w:r>
-      <w:proofErr w:type="spellEnd"/>
-      <w:r>
-        <w:t xml:space="preserve"> also added different colours for the players so It will be easier to identify them, they have match</w:t>
-      </w:r>
-      <w:r>
-        <w:t>i</w:t>
-      </w:r>
-      <w:r>
-        <w:t>ng UI colo</w:t>
-      </w:r>
-      <w:r>
-        <w:t>u</w:t>
-      </w:r>
-      <w:r>
-        <w:t>rs.</w:t>
-      </w:r>
-    </w:p>
-    <w:p>
-      <w:r>
-        <w:t>Now I need to add the multiple game modes and also 3 player, 4 player counts. then I can start tackling the powerups</w:t>
-      </w:r>
-    </w:p>
-    <w:p/>
-    <w:p>
-      <w:r>
-        <w:t>28/5</w:t>
-      </w:r>
-    </w:p>
-    <w:p>
-      <w:r>
-        <w:t>Update 7</w:t>
-      </w:r>
-    </w:p>
-    <w:p>
-      <w:r>
-        <w:t>Things that I have added</w:t>
+        <w:t>Players number UI</w:t>
       </w:r>
     </w:p>
     <w:p>
@@ -468,11 +335,11 @@
         <w:pStyle w:val="ListParagraph"/>
         <w:numPr>
           <w:ilvl w:val="0"/>
-          <w:numId w:val="2"/>
+          <w:numId w:val="6"/>
         </w:numPr>
       </w:pPr>
       <w:r>
-        <w:t>Players number UI</w:t>
+        <w:t>3 players</w:t>
       </w:r>
     </w:p>
     <w:p>
@@ -480,11 +347,11 @@
         <w:pStyle w:val="ListParagraph"/>
         <w:numPr>
           <w:ilvl w:val="0"/>
-          <w:numId w:val="2"/>
+          <w:numId w:val="6"/>
         </w:numPr>
       </w:pPr>
       <w:r>
-        <w:t>3 players</w:t>
+        <w:t>4 players</w:t>
       </w:r>
     </w:p>
     <w:p>
@@ -492,137 +359,448 @@
         <w:pStyle w:val="ListParagraph"/>
         <w:numPr>
           <w:ilvl w:val="0"/>
-          <w:numId w:val="2"/>
+          <w:numId w:val="6"/>
         </w:numPr>
       </w:pPr>
       <w:r>
-        <w:t>4</w:t>
-      </w:r>
-      <w:r>
-        <w:t xml:space="preserve"> players</w:t>
-      </w:r>
-    </w:p>
-    <w:p>
-      <w:pPr>
-        <w:pStyle w:val="ListParagraph"/>
+        <w:t>Game Juice (Camera Shakes, animation curves) The game feels more alive with the juice additions. before it felt flat and unresponsive. the camera shakes and time curves fixes all of these issues.</w:t>
+      </w:r>
+    </w:p>
+    <w:p>
+      <w:r>
+        <w:t>audio is still yet to be added to the game but that is for another time.</w:t>
+      </w:r>
+    </w:p>
+    <w:p/>
+    <w:p>
+      <w:r>
+        <w:t>30/5</w:t>
+      </w:r>
+    </w:p>
+    <w:p>
+      <w:r>
+        <w:t>Update 8</w:t>
+      </w:r>
+    </w:p>
+    <w:p>
+      <w:r>
+        <w:t>I am going to change how the shove system impacts the other movements of the player. At this point the players movement is very plain and has no skill application. I want to punish players to not make them spam the dodge or the shove</w:t>
+      </w:r>
+    </w:p>
+    <w:p>
+      <w:pPr>
+        <w:rPr>
+          <w:rFonts w:cstheme="minorHAnsi"/>
+        </w:rPr>
+      </w:pPr>
+      <w:r>
+        <w:t xml:space="preserve">I am going to make the player stager their movement if they miss a shove or a dodge unnecessarily </w:t>
+      </w:r>
+      <w:r>
+        <w:br/>
+      </w:r>
+      <w:r>
+        <w:br/>
+        <w:t>1/6</w:t>
+      </w:r>
+      <w:r>
+        <w:br/>
+      </w:r>
+      <w:r>
+        <w:rPr>
+          <w:rFonts w:cstheme="minorHAnsi"/>
+        </w:rPr>
+        <w:t>Update 9</w:t>
+      </w:r>
+    </w:p>
+    <w:p>
+      <w:pPr>
+        <w:pStyle w:val="NormalWeb"/>
+        <w:spacing w:before="0" w:beforeAutospacing="0" w:after="0" w:afterAutospacing="0"/>
+        <w:rPr>
+          <w:rFonts w:asciiTheme="minorHAnsi" w:hAnsiTheme="minorHAnsi" w:cstheme="minorHAnsi"/>
+          <w:sz w:val="22"/>
+          <w:szCs w:val="22"/>
+        </w:rPr>
+      </w:pPr>
+      <w:r>
+        <w:rPr>
+          <w:rFonts w:asciiTheme="minorHAnsi" w:hAnsiTheme="minorHAnsi" w:cstheme="minorHAnsi"/>
+          <w:sz w:val="22"/>
+          <w:szCs w:val="22"/>
+        </w:rPr>
+        <w:t>The shove works so now I want to implement the pause play system and also another game mode. First, I will do the game mode so the pause play system know what to do in specific conditions like exit to menu or restart match</w:t>
+      </w:r>
+      <w:r>
+        <w:rPr>
+          <w:rFonts w:asciiTheme="minorHAnsi" w:hAnsiTheme="minorHAnsi" w:cstheme="minorHAnsi"/>
+          <w:sz w:val="22"/>
+          <w:szCs w:val="22"/>
+        </w:rPr>
+        <w:br/>
+      </w:r>
+      <w:r>
+        <w:rPr>
+          <w:rFonts w:asciiTheme="minorHAnsi" w:hAnsiTheme="minorHAnsi" w:cstheme="minorHAnsi"/>
+          <w:sz w:val="22"/>
+          <w:szCs w:val="22"/>
+        </w:rPr>
+        <w:br/>
+        <w:t>the game mode the players are currently locked to is a versus game mode. To even the odds in the 4-person game mode or to make teams and play the team match is going to be implemented. It will start the match with 4 players in 2 teams with 2 players in each team</w:t>
+      </w:r>
+      <w:r>
+        <w:rPr>
+          <w:rFonts w:asciiTheme="minorHAnsi" w:hAnsiTheme="minorHAnsi" w:cstheme="minorHAnsi"/>
+          <w:sz w:val="22"/>
+          <w:szCs w:val="22"/>
+        </w:rPr>
+        <w:t>. Team members will be spawned with the same colours (team A red | team B blue)</w:t>
+      </w:r>
+      <w:r>
+        <w:rPr>
+          <w:rFonts w:asciiTheme="minorHAnsi" w:hAnsiTheme="minorHAnsi" w:cstheme="minorHAnsi"/>
+          <w:sz w:val="22"/>
+          <w:szCs w:val="22"/>
+        </w:rPr>
+        <w:t xml:space="preserve">. A team wins if the players from the opposing team dies. First team to win 3 rounds wins the match (3 rounds for now but that could be subject to change). I won’t be doing the point system for this game mode because it complicates the game mode. </w:t>
+      </w:r>
+      <w:r>
+        <w:rPr>
+          <w:rFonts w:asciiTheme="minorHAnsi" w:hAnsiTheme="minorHAnsi" w:cstheme="minorHAnsi"/>
+          <w:sz w:val="22"/>
+          <w:szCs w:val="22"/>
+        </w:rPr>
+        <w:t>The ring size change will change if there is a all players are alive or 1 player from each team is alive.</w:t>
+      </w:r>
+      <w:r>
+        <w:rPr>
+          <w:rFonts w:asciiTheme="minorHAnsi" w:hAnsiTheme="minorHAnsi" w:cstheme="minorHAnsi"/>
+          <w:sz w:val="22"/>
+          <w:szCs w:val="22"/>
+        </w:rPr>
+        <w:br/>
+      </w:r>
+      <w:r>
+        <w:rPr>
+          <w:rFonts w:asciiTheme="minorHAnsi" w:hAnsiTheme="minorHAnsi" w:cstheme="minorHAnsi"/>
+          <w:sz w:val="22"/>
+          <w:szCs w:val="22"/>
+        </w:rPr>
+        <w:br/>
+        <w:t>The game UI flow is</w:t>
+      </w:r>
+      <w:r>
+        <w:rPr>
+          <w:rFonts w:asciiTheme="minorHAnsi" w:hAnsiTheme="minorHAnsi" w:cstheme="minorHAnsi"/>
+          <w:sz w:val="22"/>
+          <w:szCs w:val="22"/>
+        </w:rPr>
+        <w:t>:</w:t>
+      </w:r>
+      <w:r>
+        <w:rPr>
+          <w:rFonts w:asciiTheme="minorHAnsi" w:hAnsiTheme="minorHAnsi" w:cstheme="minorHAnsi"/>
+          <w:sz w:val="22"/>
+          <w:szCs w:val="22"/>
+        </w:rPr>
+        <w:br/>
+        <w:t>game boots -&gt; versus mode / Team mode</w:t>
+      </w:r>
+      <w:r>
+        <w:rPr>
+          <w:rFonts w:asciiTheme="minorHAnsi" w:hAnsiTheme="minorHAnsi" w:cstheme="minorHAnsi"/>
+          <w:sz w:val="22"/>
+          <w:szCs w:val="22"/>
+        </w:rPr>
+        <w:br/>
+      </w:r>
+      <w:r>
+        <w:rPr>
+          <w:rFonts w:asciiTheme="minorHAnsi" w:hAnsiTheme="minorHAnsi" w:cstheme="minorHAnsi"/>
+          <w:sz w:val="22"/>
+          <w:szCs w:val="22"/>
+        </w:rPr>
+        <w:t>Versus mode selected -&gt; 2 players / 3 players / 4 players</w:t>
+      </w:r>
+      <w:r>
+        <w:rPr>
+          <w:rFonts w:asciiTheme="minorHAnsi" w:hAnsiTheme="minorHAnsi" w:cstheme="minorHAnsi"/>
+          <w:sz w:val="22"/>
+          <w:szCs w:val="22"/>
+        </w:rPr>
+        <w:br/>
+      </w:r>
+      <w:r>
+        <w:rPr>
+          <w:rFonts w:asciiTheme="minorHAnsi" w:hAnsiTheme="minorHAnsi" w:cstheme="minorHAnsi"/>
+          <w:sz w:val="22"/>
+          <w:szCs w:val="22"/>
+        </w:rPr>
+        <w:lastRenderedPageBreak/>
+        <w:t>Team mode selected -&gt; starts game with 4 players/2 team split and game mode begins</w:t>
+      </w:r>
+      <w:r>
+        <w:rPr>
+          <w:rFonts w:asciiTheme="minorHAnsi" w:hAnsiTheme="minorHAnsi" w:cstheme="minorHAnsi"/>
+          <w:sz w:val="22"/>
+          <w:szCs w:val="22"/>
+        </w:rPr>
+        <w:br/>
+      </w:r>
+    </w:p>
+    <w:p>
+      <w:pPr>
+        <w:pStyle w:val="NormalWeb"/>
         <w:numPr>
           <w:ilvl w:val="0"/>
-          <w:numId w:val="2"/>
+          <w:numId w:val="8"/>
         </w:numPr>
-      </w:pPr>
-      <w:r>
-        <w:lastRenderedPageBreak/>
-        <w:t xml:space="preserve">Game Juice (Camera Shakes, animation curves) The game feels more alive with the juice additions. before it felt flat and </w:t>
-      </w:r>
-      <w:r>
-        <w:t>unresponsive</w:t>
-      </w:r>
-      <w:r>
-        <w:t>. the camera shakes and time curves fixes all of these issues.</w:t>
-      </w:r>
-    </w:p>
-    <w:p>
-      <w:pPr>
-        <w:pStyle w:val="ListParagraph"/>
+        <w:spacing w:before="0" w:beforeAutospacing="0" w:after="0" w:afterAutospacing="0"/>
+        <w:rPr>
+          <w:rFonts w:asciiTheme="minorHAnsi" w:hAnsiTheme="minorHAnsi" w:cstheme="minorHAnsi"/>
+          <w:sz w:val="22"/>
+          <w:szCs w:val="22"/>
+        </w:rPr>
+      </w:pPr>
+      <w:r>
+        <w:rPr>
+          <w:rFonts w:asciiTheme="minorHAnsi" w:hAnsiTheme="minorHAnsi" w:cstheme="minorHAnsi"/>
+          <w:sz w:val="22"/>
+          <w:szCs w:val="22"/>
+        </w:rPr>
+        <w:t xml:space="preserve">make a pause, play, restart and exit game mode button. </w:t>
+      </w:r>
+    </w:p>
+    <w:p>
+      <w:pPr>
+        <w:pStyle w:val="NormalWeb"/>
         <w:numPr>
           <w:ilvl w:val="0"/>
-          <w:numId w:val="2"/>
+          <w:numId w:val="8"/>
         </w:numPr>
-      </w:pPr>
-      <w:r>
-        <w:t>audio is still yet to be added to the game but that is for another time.</w:t>
-      </w:r>
-    </w:p>
-    <w:p/>
-    <w:p>
-      <w:r>
-        <w:t>30/5</w:t>
-      </w:r>
-    </w:p>
-    <w:p>
-      <w:r>
-        <w:t>Update 8</w:t>
-      </w:r>
-    </w:p>
-    <w:p>
-      <w:r>
-        <w:t>I am going to change how the shove system impacts the other movements of the player</w:t>
+        <w:spacing w:before="0" w:beforeAutospacing="0" w:after="0" w:afterAutospacing="0"/>
+        <w:rPr>
+          <w:rFonts w:asciiTheme="minorHAnsi" w:hAnsiTheme="minorHAnsi" w:cstheme="minorHAnsi"/>
+          <w:sz w:val="22"/>
+          <w:szCs w:val="22"/>
+        </w:rPr>
+      </w:pPr>
+      <w:r>
+        <w:rPr>
+          <w:rFonts w:asciiTheme="minorHAnsi" w:hAnsiTheme="minorHAnsi" w:cstheme="minorHAnsi"/>
+          <w:sz w:val="22"/>
+          <w:szCs w:val="22"/>
+        </w:rPr>
+        <w:t xml:space="preserve">when the player hits the pause button three other buttons show up. </w:t>
+      </w:r>
+    </w:p>
+    <w:p>
+      <w:pPr>
+        <w:pStyle w:val="NormalWeb"/>
+        <w:numPr>
+          <w:ilvl w:val="0"/>
+          <w:numId w:val="8"/>
+        </w:numPr>
+        <w:spacing w:before="0" w:beforeAutospacing="0" w:after="0" w:afterAutospacing="0"/>
+        <w:rPr>
+          <w:rFonts w:asciiTheme="minorHAnsi" w:hAnsiTheme="minorHAnsi" w:cstheme="minorHAnsi"/>
+          <w:sz w:val="22"/>
+          <w:szCs w:val="22"/>
+        </w:rPr>
+      </w:pPr>
+      <w:r>
+        <w:rPr>
+          <w:rFonts w:asciiTheme="minorHAnsi" w:hAnsiTheme="minorHAnsi" w:cstheme="minorHAnsi"/>
+          <w:sz w:val="22"/>
+          <w:szCs w:val="22"/>
+        </w:rPr>
+        <w:t>play button resumes the current match</w:t>
+      </w:r>
+      <w:r>
+        <w:rPr>
+          <w:rFonts w:asciiTheme="minorHAnsi" w:hAnsiTheme="minorHAnsi" w:cstheme="minorHAnsi"/>
+          <w:sz w:val="22"/>
+          <w:szCs w:val="22"/>
+        </w:rPr>
+        <w:t>.</w:t>
+      </w:r>
+    </w:p>
+    <w:p>
+      <w:pPr>
+        <w:pStyle w:val="NormalWeb"/>
+        <w:numPr>
+          <w:ilvl w:val="0"/>
+          <w:numId w:val="8"/>
+        </w:numPr>
+        <w:spacing w:before="0" w:beforeAutospacing="0" w:after="0" w:afterAutospacing="0"/>
+        <w:rPr>
+          <w:rFonts w:asciiTheme="minorHAnsi" w:hAnsiTheme="minorHAnsi" w:cstheme="minorHAnsi"/>
+          <w:sz w:val="22"/>
+          <w:szCs w:val="22"/>
+        </w:rPr>
+      </w:pPr>
+      <w:r>
+        <w:rPr>
+          <w:rFonts w:asciiTheme="minorHAnsi" w:hAnsiTheme="minorHAnsi" w:cstheme="minorHAnsi"/>
+          <w:sz w:val="22"/>
+          <w:szCs w:val="22"/>
+        </w:rPr>
+        <w:t xml:space="preserve">restart button restarts the current match i.e. same number of players and </w:t>
+      </w:r>
+      <w:r>
+        <w:rPr>
+          <w:rFonts w:asciiTheme="minorHAnsi" w:hAnsiTheme="minorHAnsi" w:cstheme="minorHAnsi"/>
+          <w:sz w:val="22"/>
+          <w:szCs w:val="22"/>
+        </w:rPr>
+        <w:t xml:space="preserve">the same </w:t>
+      </w:r>
+      <w:r>
+        <w:rPr>
+          <w:rFonts w:asciiTheme="minorHAnsi" w:hAnsiTheme="minorHAnsi" w:cstheme="minorHAnsi"/>
+          <w:sz w:val="22"/>
+          <w:szCs w:val="22"/>
+        </w:rPr>
+        <w:t>game mode</w:t>
+      </w:r>
+    </w:p>
+    <w:p>
+      <w:pPr>
+        <w:pStyle w:val="NormalWeb"/>
+        <w:numPr>
+          <w:ilvl w:val="0"/>
+          <w:numId w:val="8"/>
+        </w:numPr>
+        <w:spacing w:before="0" w:beforeAutospacing="0" w:after="0" w:afterAutospacing="0"/>
+        <w:rPr>
+          <w:rFonts w:asciiTheme="minorHAnsi" w:hAnsiTheme="minorHAnsi" w:cstheme="minorHAnsi"/>
+          <w:sz w:val="22"/>
+          <w:szCs w:val="22"/>
+        </w:rPr>
+      </w:pPr>
+      <w:r>
+        <w:rPr>
+          <w:rFonts w:asciiTheme="minorHAnsi" w:hAnsiTheme="minorHAnsi" w:cstheme="minorHAnsi"/>
+          <w:sz w:val="22"/>
+          <w:szCs w:val="22"/>
+        </w:rPr>
+        <w:t>exit</w:t>
+      </w:r>
+      <w:r>
+        <w:rPr>
+          <w:rFonts w:asciiTheme="minorHAnsi" w:hAnsiTheme="minorHAnsi" w:cstheme="minorHAnsi"/>
+          <w:sz w:val="22"/>
+          <w:szCs w:val="22"/>
+        </w:rPr>
+        <w:t xml:space="preserve"> button</w:t>
+      </w:r>
+      <w:r>
+        <w:rPr>
+          <w:rFonts w:asciiTheme="minorHAnsi" w:hAnsiTheme="minorHAnsi" w:cstheme="minorHAnsi"/>
+          <w:sz w:val="22"/>
+          <w:szCs w:val="22"/>
+        </w:rPr>
+        <w:t xml:space="preserve"> take</w:t>
+      </w:r>
+      <w:r>
+        <w:rPr>
+          <w:rFonts w:asciiTheme="minorHAnsi" w:hAnsiTheme="minorHAnsi" w:cstheme="minorHAnsi"/>
+          <w:sz w:val="22"/>
+          <w:szCs w:val="22"/>
+        </w:rPr>
+        <w:t>s</w:t>
+      </w:r>
+      <w:r>
+        <w:rPr>
+          <w:rFonts w:asciiTheme="minorHAnsi" w:hAnsiTheme="minorHAnsi" w:cstheme="minorHAnsi"/>
+          <w:sz w:val="22"/>
+          <w:szCs w:val="22"/>
+        </w:rPr>
+        <w:t xml:space="preserve"> the player back to game mode panel.</w:t>
+      </w:r>
+      <w:r>
+        <w:rPr>
+          <w:rFonts w:asciiTheme="minorHAnsi" w:hAnsiTheme="minorHAnsi" w:cstheme="minorHAnsi"/>
+          <w:sz w:val="22"/>
+          <w:szCs w:val="22"/>
+        </w:rPr>
+        <w:br/>
+      </w:r>
+    </w:p>
+    <w:p>
+      <w:pPr>
+        <w:pStyle w:val="NormalWeb"/>
+        <w:spacing w:before="0" w:beforeAutospacing="0" w:after="0" w:afterAutospacing="0"/>
+        <w:rPr>
+          <w:rFonts w:asciiTheme="minorHAnsi" w:hAnsiTheme="minorHAnsi" w:cstheme="minorHAnsi"/>
+          <w:sz w:val="22"/>
+          <w:szCs w:val="22"/>
+        </w:rPr>
+      </w:pPr>
+      <w:r>
+        <w:rPr>
+          <w:rFonts w:asciiTheme="minorHAnsi" w:hAnsiTheme="minorHAnsi" w:cstheme="minorHAnsi"/>
+          <w:sz w:val="22"/>
+          <w:szCs w:val="22"/>
+        </w:rPr>
+        <w:t>Update 10</w:t>
+      </w:r>
+    </w:p>
+    <w:p>
+      <w:pPr>
+        <w:pStyle w:val="NormalWeb"/>
+        <w:spacing w:before="0" w:beforeAutospacing="0" w:after="0" w:afterAutospacing="0"/>
+        <w:rPr>
+          <w:rFonts w:asciiTheme="minorHAnsi" w:hAnsiTheme="minorHAnsi" w:cstheme="minorHAnsi"/>
+          <w:sz w:val="22"/>
+          <w:szCs w:val="22"/>
+        </w:rPr>
+      </w:pPr>
+      <w:r>
+        <w:rPr>
+          <w:rFonts w:asciiTheme="minorHAnsi" w:hAnsiTheme="minorHAnsi" w:cstheme="minorHAnsi"/>
+          <w:sz w:val="22"/>
+          <w:szCs w:val="22"/>
+        </w:rPr>
+        <w:t xml:space="preserve">The </w:t>
+      </w:r>
+      <w:r>
+        <w:rPr>
+          <w:rFonts w:asciiTheme="minorHAnsi" w:hAnsiTheme="minorHAnsi" w:cstheme="minorHAnsi"/>
+          <w:sz w:val="22"/>
+          <w:szCs w:val="22"/>
+        </w:rPr>
+        <w:t xml:space="preserve">team game mode works but now I have come across another issue where the if the player is </w:t>
+      </w:r>
+      <w:proofErr w:type="gramStart"/>
+      <w:r>
+        <w:rPr>
+          <w:rFonts w:asciiTheme="minorHAnsi" w:hAnsiTheme="minorHAnsi" w:cstheme="minorHAnsi"/>
+          <w:sz w:val="22"/>
+          <w:szCs w:val="22"/>
+        </w:rPr>
+        <w:t>pushed(</w:t>
+      </w:r>
+      <w:proofErr w:type="gramEnd"/>
+      <w:r>
+        <w:rPr>
+          <w:rFonts w:asciiTheme="minorHAnsi" w:hAnsiTheme="minorHAnsi" w:cstheme="minorHAnsi"/>
+          <w:sz w:val="22"/>
+          <w:szCs w:val="22"/>
+        </w:rPr>
+        <w:t>not shove mechanic)by the other players rigid body out of the ring then the point system does not award any point even though technically this is a point for the player who pushes</w:t>
+      </w:r>
+      <w:r>
+        <w:rPr>
+          <w:rFonts w:asciiTheme="minorHAnsi" w:hAnsiTheme="minorHAnsi" w:cstheme="minorHAnsi"/>
+          <w:sz w:val="22"/>
+          <w:szCs w:val="22"/>
+        </w:rPr>
+        <w:t xml:space="preserve">. </w:t>
       </w:r>
       <w:bookmarkStart w:id="0" w:name="_GoBack"/>
       <w:bookmarkEnd w:id="0"/>
-      <w:r>
-        <w:t>. At this point the players mov</w:t>
-      </w:r>
-      <w:r>
-        <w:t>e</w:t>
-      </w:r>
-      <w:r>
-        <w:t>ment is very plain and has no skill application. I want to punish players to not make them spam the dodge or the shove</w:t>
-      </w:r>
-    </w:p>
-    <w:p>
-      <w:r>
-        <w:t xml:space="preserve">I am going to make the player stager their movement if they miss a shove or a dodge </w:t>
-      </w:r>
-      <w:r>
-        <w:t>unnecessarily</w:t>
-      </w:r>
-      <w:r>
-        <w:t xml:space="preserve"> </w:t>
-      </w:r>
-    </w:p>
-    <w:p/>
-    <w:p/>
-    <w:p/>
-    <w:p/>
-    <w:p/>
-    <w:p/>
-    <w:p/>
-    <w:p/>
-    <w:p/>
-    <w:p/>
-    <w:p/>
-    <w:p/>
-    <w:p/>
-    <w:p/>
-    <w:p/>
-    <w:p/>
-    <w:p/>
-    <w:p/>
-    <w:p/>
-    <w:p/>
-    <w:p/>
-    <w:p/>
-    <w:p/>
-    <w:p/>
-    <w:p/>
-    <w:p/>
-    <w:p/>
-    <w:p/>
-    <w:p/>
-    <w:p/>
-    <w:p/>
-    <w:p/>
-    <w:p/>
-    <w:p/>
-    <w:p/>
-    <w:p/>
-    <w:p/>
-    <w:p/>
-    <w:p/>
-    <w:p/>
-    <w:p/>
-    <w:p/>
-    <w:p/>
-    <w:p/>
-    <w:p/>
-    <w:p/>
-    <w:p/>
-    <w:p/>
-    <w:p/>
-    <w:p/>
-    <w:p/>
-    <w:p/>
+    </w:p>
     <w:sectPr>
       <w:pgSz w:w="11906" w:h="16838"/>
       <w:pgMar w:top="1440" w:right="1440" w:bottom="1440" w:left="1440" w:header="708" w:footer="708" w:gutter="0"/>
@@ -861,11 +1039,707 @@
       </w:rPr>
     </w:lvl>
   </w:abstractNum>
+  <w:abstractNum w:abstractNumId="2" w15:restartNumberingAfterBreak="0">
+    <w:nsid w:val="1BA00181"/>
+    <w:multiLevelType w:val="hybridMultilevel"/>
+    <w:tmpl w:val="3C6A2070"/>
+    <w:lvl w:ilvl="0" w:tplc="08090001">
+      <w:start w:val="1"/>
+      <w:numFmt w:val="bullet"/>
+      <w:lvlText w:val=""/>
+      <w:lvlJc w:val="left"/>
+      <w:pPr>
+        <w:ind w:left="720" w:hanging="360"/>
+      </w:pPr>
+      <w:rPr>
+        <w:rFonts w:ascii="Symbol" w:hAnsi="Symbol" w:hint="default"/>
+      </w:rPr>
+    </w:lvl>
+    <w:lvl w:ilvl="1" w:tplc="08090003" w:tentative="1">
+      <w:start w:val="1"/>
+      <w:numFmt w:val="bullet"/>
+      <w:lvlText w:val="o"/>
+      <w:lvlJc w:val="left"/>
+      <w:pPr>
+        <w:ind w:left="1440" w:hanging="360"/>
+      </w:pPr>
+      <w:rPr>
+        <w:rFonts w:ascii="Courier New" w:hAnsi="Courier New" w:cs="Courier New" w:hint="default"/>
+      </w:rPr>
+    </w:lvl>
+    <w:lvl w:ilvl="2" w:tplc="08090005" w:tentative="1">
+      <w:start w:val="1"/>
+      <w:numFmt w:val="bullet"/>
+      <w:lvlText w:val=""/>
+      <w:lvlJc w:val="left"/>
+      <w:pPr>
+        <w:ind w:left="2160" w:hanging="360"/>
+      </w:pPr>
+      <w:rPr>
+        <w:rFonts w:ascii="Wingdings" w:hAnsi="Wingdings" w:hint="default"/>
+      </w:rPr>
+    </w:lvl>
+    <w:lvl w:ilvl="3" w:tplc="08090001" w:tentative="1">
+      <w:start w:val="1"/>
+      <w:numFmt w:val="bullet"/>
+      <w:lvlText w:val=""/>
+      <w:lvlJc w:val="left"/>
+      <w:pPr>
+        <w:ind w:left="2880" w:hanging="360"/>
+      </w:pPr>
+      <w:rPr>
+        <w:rFonts w:ascii="Symbol" w:hAnsi="Symbol" w:hint="default"/>
+      </w:rPr>
+    </w:lvl>
+    <w:lvl w:ilvl="4" w:tplc="08090003" w:tentative="1">
+      <w:start w:val="1"/>
+      <w:numFmt w:val="bullet"/>
+      <w:lvlText w:val="o"/>
+      <w:lvlJc w:val="left"/>
+      <w:pPr>
+        <w:ind w:left="3600" w:hanging="360"/>
+      </w:pPr>
+      <w:rPr>
+        <w:rFonts w:ascii="Courier New" w:hAnsi="Courier New" w:cs="Courier New" w:hint="default"/>
+      </w:rPr>
+    </w:lvl>
+    <w:lvl w:ilvl="5" w:tplc="08090005" w:tentative="1">
+      <w:start w:val="1"/>
+      <w:numFmt w:val="bullet"/>
+      <w:lvlText w:val=""/>
+      <w:lvlJc w:val="left"/>
+      <w:pPr>
+        <w:ind w:left="4320" w:hanging="360"/>
+      </w:pPr>
+      <w:rPr>
+        <w:rFonts w:ascii="Wingdings" w:hAnsi="Wingdings" w:hint="default"/>
+      </w:rPr>
+    </w:lvl>
+    <w:lvl w:ilvl="6" w:tplc="08090001" w:tentative="1">
+      <w:start w:val="1"/>
+      <w:numFmt w:val="bullet"/>
+      <w:lvlText w:val=""/>
+      <w:lvlJc w:val="left"/>
+      <w:pPr>
+        <w:ind w:left="5040" w:hanging="360"/>
+      </w:pPr>
+      <w:rPr>
+        <w:rFonts w:ascii="Symbol" w:hAnsi="Symbol" w:hint="default"/>
+      </w:rPr>
+    </w:lvl>
+    <w:lvl w:ilvl="7" w:tplc="08090003" w:tentative="1">
+      <w:start w:val="1"/>
+      <w:numFmt w:val="bullet"/>
+      <w:lvlText w:val="o"/>
+      <w:lvlJc w:val="left"/>
+      <w:pPr>
+        <w:ind w:left="5760" w:hanging="360"/>
+      </w:pPr>
+      <w:rPr>
+        <w:rFonts w:ascii="Courier New" w:hAnsi="Courier New" w:cs="Courier New" w:hint="default"/>
+      </w:rPr>
+    </w:lvl>
+    <w:lvl w:ilvl="8" w:tplc="08090005" w:tentative="1">
+      <w:start w:val="1"/>
+      <w:numFmt w:val="bullet"/>
+      <w:lvlText w:val=""/>
+      <w:lvlJc w:val="left"/>
+      <w:pPr>
+        <w:ind w:left="6480" w:hanging="360"/>
+      </w:pPr>
+      <w:rPr>
+        <w:rFonts w:ascii="Wingdings" w:hAnsi="Wingdings" w:hint="default"/>
+      </w:rPr>
+    </w:lvl>
+  </w:abstractNum>
+  <w:abstractNum w:abstractNumId="3" w15:restartNumberingAfterBreak="0">
+    <w:nsid w:val="2BF33FC5"/>
+    <w:multiLevelType w:val="hybridMultilevel"/>
+    <w:tmpl w:val="38207818"/>
+    <w:lvl w:ilvl="0" w:tplc="08090001">
+      <w:start w:val="1"/>
+      <w:numFmt w:val="bullet"/>
+      <w:lvlText w:val=""/>
+      <w:lvlJc w:val="left"/>
+      <w:pPr>
+        <w:ind w:left="720" w:hanging="360"/>
+      </w:pPr>
+      <w:rPr>
+        <w:rFonts w:ascii="Symbol" w:hAnsi="Symbol" w:hint="default"/>
+      </w:rPr>
+    </w:lvl>
+    <w:lvl w:ilvl="1" w:tplc="08090003" w:tentative="1">
+      <w:start w:val="1"/>
+      <w:numFmt w:val="bullet"/>
+      <w:lvlText w:val="o"/>
+      <w:lvlJc w:val="left"/>
+      <w:pPr>
+        <w:ind w:left="1440" w:hanging="360"/>
+      </w:pPr>
+      <w:rPr>
+        <w:rFonts w:ascii="Courier New" w:hAnsi="Courier New" w:cs="Courier New" w:hint="default"/>
+      </w:rPr>
+    </w:lvl>
+    <w:lvl w:ilvl="2" w:tplc="08090005" w:tentative="1">
+      <w:start w:val="1"/>
+      <w:numFmt w:val="bullet"/>
+      <w:lvlText w:val=""/>
+      <w:lvlJc w:val="left"/>
+      <w:pPr>
+        <w:ind w:left="2160" w:hanging="360"/>
+      </w:pPr>
+      <w:rPr>
+        <w:rFonts w:ascii="Wingdings" w:hAnsi="Wingdings" w:hint="default"/>
+      </w:rPr>
+    </w:lvl>
+    <w:lvl w:ilvl="3" w:tplc="08090001" w:tentative="1">
+      <w:start w:val="1"/>
+      <w:numFmt w:val="bullet"/>
+      <w:lvlText w:val=""/>
+      <w:lvlJc w:val="left"/>
+      <w:pPr>
+        <w:ind w:left="2880" w:hanging="360"/>
+      </w:pPr>
+      <w:rPr>
+        <w:rFonts w:ascii="Symbol" w:hAnsi="Symbol" w:hint="default"/>
+      </w:rPr>
+    </w:lvl>
+    <w:lvl w:ilvl="4" w:tplc="08090003" w:tentative="1">
+      <w:start w:val="1"/>
+      <w:numFmt w:val="bullet"/>
+      <w:lvlText w:val="o"/>
+      <w:lvlJc w:val="left"/>
+      <w:pPr>
+        <w:ind w:left="3600" w:hanging="360"/>
+      </w:pPr>
+      <w:rPr>
+        <w:rFonts w:ascii="Courier New" w:hAnsi="Courier New" w:cs="Courier New" w:hint="default"/>
+      </w:rPr>
+    </w:lvl>
+    <w:lvl w:ilvl="5" w:tplc="08090005" w:tentative="1">
+      <w:start w:val="1"/>
+      <w:numFmt w:val="bullet"/>
+      <w:lvlText w:val=""/>
+      <w:lvlJc w:val="left"/>
+      <w:pPr>
+        <w:ind w:left="4320" w:hanging="360"/>
+      </w:pPr>
+      <w:rPr>
+        <w:rFonts w:ascii="Wingdings" w:hAnsi="Wingdings" w:hint="default"/>
+      </w:rPr>
+    </w:lvl>
+    <w:lvl w:ilvl="6" w:tplc="08090001" w:tentative="1">
+      <w:start w:val="1"/>
+      <w:numFmt w:val="bullet"/>
+      <w:lvlText w:val=""/>
+      <w:lvlJc w:val="left"/>
+      <w:pPr>
+        <w:ind w:left="5040" w:hanging="360"/>
+      </w:pPr>
+      <w:rPr>
+        <w:rFonts w:ascii="Symbol" w:hAnsi="Symbol" w:hint="default"/>
+      </w:rPr>
+    </w:lvl>
+    <w:lvl w:ilvl="7" w:tplc="08090003" w:tentative="1">
+      <w:start w:val="1"/>
+      <w:numFmt w:val="bullet"/>
+      <w:lvlText w:val="o"/>
+      <w:lvlJc w:val="left"/>
+      <w:pPr>
+        <w:ind w:left="5760" w:hanging="360"/>
+      </w:pPr>
+      <w:rPr>
+        <w:rFonts w:ascii="Courier New" w:hAnsi="Courier New" w:cs="Courier New" w:hint="default"/>
+      </w:rPr>
+    </w:lvl>
+    <w:lvl w:ilvl="8" w:tplc="08090005" w:tentative="1">
+      <w:start w:val="1"/>
+      <w:numFmt w:val="bullet"/>
+      <w:lvlText w:val=""/>
+      <w:lvlJc w:val="left"/>
+      <w:pPr>
+        <w:ind w:left="6480" w:hanging="360"/>
+      </w:pPr>
+      <w:rPr>
+        <w:rFonts w:ascii="Wingdings" w:hAnsi="Wingdings" w:hint="default"/>
+      </w:rPr>
+    </w:lvl>
+  </w:abstractNum>
+  <w:abstractNum w:abstractNumId="4" w15:restartNumberingAfterBreak="0">
+    <w:nsid w:val="53720262"/>
+    <w:multiLevelType w:val="hybridMultilevel"/>
+    <w:tmpl w:val="35C88ABE"/>
+    <w:lvl w:ilvl="0" w:tplc="08090001">
+      <w:start w:val="1"/>
+      <w:numFmt w:val="bullet"/>
+      <w:lvlText w:val=""/>
+      <w:lvlJc w:val="left"/>
+      <w:pPr>
+        <w:ind w:left="720" w:hanging="360"/>
+      </w:pPr>
+      <w:rPr>
+        <w:rFonts w:ascii="Symbol" w:hAnsi="Symbol" w:hint="default"/>
+      </w:rPr>
+    </w:lvl>
+    <w:lvl w:ilvl="1" w:tplc="08090003" w:tentative="1">
+      <w:start w:val="1"/>
+      <w:numFmt w:val="bullet"/>
+      <w:lvlText w:val="o"/>
+      <w:lvlJc w:val="left"/>
+      <w:pPr>
+        <w:ind w:left="1440" w:hanging="360"/>
+      </w:pPr>
+      <w:rPr>
+        <w:rFonts w:ascii="Courier New" w:hAnsi="Courier New" w:cs="Courier New" w:hint="default"/>
+      </w:rPr>
+    </w:lvl>
+    <w:lvl w:ilvl="2" w:tplc="08090005" w:tentative="1">
+      <w:start w:val="1"/>
+      <w:numFmt w:val="bullet"/>
+      <w:lvlText w:val=""/>
+      <w:lvlJc w:val="left"/>
+      <w:pPr>
+        <w:ind w:left="2160" w:hanging="360"/>
+      </w:pPr>
+      <w:rPr>
+        <w:rFonts w:ascii="Wingdings" w:hAnsi="Wingdings" w:hint="default"/>
+      </w:rPr>
+    </w:lvl>
+    <w:lvl w:ilvl="3" w:tplc="08090001" w:tentative="1">
+      <w:start w:val="1"/>
+      <w:numFmt w:val="bullet"/>
+      <w:lvlText w:val=""/>
+      <w:lvlJc w:val="left"/>
+      <w:pPr>
+        <w:ind w:left="2880" w:hanging="360"/>
+      </w:pPr>
+      <w:rPr>
+        <w:rFonts w:ascii="Symbol" w:hAnsi="Symbol" w:hint="default"/>
+      </w:rPr>
+    </w:lvl>
+    <w:lvl w:ilvl="4" w:tplc="08090003" w:tentative="1">
+      <w:start w:val="1"/>
+      <w:numFmt w:val="bullet"/>
+      <w:lvlText w:val="o"/>
+      <w:lvlJc w:val="left"/>
+      <w:pPr>
+        <w:ind w:left="3600" w:hanging="360"/>
+      </w:pPr>
+      <w:rPr>
+        <w:rFonts w:ascii="Courier New" w:hAnsi="Courier New" w:cs="Courier New" w:hint="default"/>
+      </w:rPr>
+    </w:lvl>
+    <w:lvl w:ilvl="5" w:tplc="08090005" w:tentative="1">
+      <w:start w:val="1"/>
+      <w:numFmt w:val="bullet"/>
+      <w:lvlText w:val=""/>
+      <w:lvlJc w:val="left"/>
+      <w:pPr>
+        <w:ind w:left="4320" w:hanging="360"/>
+      </w:pPr>
+      <w:rPr>
+        <w:rFonts w:ascii="Wingdings" w:hAnsi="Wingdings" w:hint="default"/>
+      </w:rPr>
+    </w:lvl>
+    <w:lvl w:ilvl="6" w:tplc="08090001" w:tentative="1">
+      <w:start w:val="1"/>
+      <w:numFmt w:val="bullet"/>
+      <w:lvlText w:val=""/>
+      <w:lvlJc w:val="left"/>
+      <w:pPr>
+        <w:ind w:left="5040" w:hanging="360"/>
+      </w:pPr>
+      <w:rPr>
+        <w:rFonts w:ascii="Symbol" w:hAnsi="Symbol" w:hint="default"/>
+      </w:rPr>
+    </w:lvl>
+    <w:lvl w:ilvl="7" w:tplc="08090003" w:tentative="1">
+      <w:start w:val="1"/>
+      <w:numFmt w:val="bullet"/>
+      <w:lvlText w:val="o"/>
+      <w:lvlJc w:val="left"/>
+      <w:pPr>
+        <w:ind w:left="5760" w:hanging="360"/>
+      </w:pPr>
+      <w:rPr>
+        <w:rFonts w:ascii="Courier New" w:hAnsi="Courier New" w:cs="Courier New" w:hint="default"/>
+      </w:rPr>
+    </w:lvl>
+    <w:lvl w:ilvl="8" w:tplc="08090005" w:tentative="1">
+      <w:start w:val="1"/>
+      <w:numFmt w:val="bullet"/>
+      <w:lvlText w:val=""/>
+      <w:lvlJc w:val="left"/>
+      <w:pPr>
+        <w:ind w:left="6480" w:hanging="360"/>
+      </w:pPr>
+      <w:rPr>
+        <w:rFonts w:ascii="Wingdings" w:hAnsi="Wingdings" w:hint="default"/>
+      </w:rPr>
+    </w:lvl>
+  </w:abstractNum>
+  <w:abstractNum w:abstractNumId="5" w15:restartNumberingAfterBreak="0">
+    <w:nsid w:val="645A1A6E"/>
+    <w:multiLevelType w:val="hybridMultilevel"/>
+    <w:tmpl w:val="56767F46"/>
+    <w:lvl w:ilvl="0" w:tplc="08090001">
+      <w:start w:val="1"/>
+      <w:numFmt w:val="bullet"/>
+      <w:lvlText w:val=""/>
+      <w:lvlJc w:val="left"/>
+      <w:pPr>
+        <w:ind w:left="720" w:hanging="360"/>
+      </w:pPr>
+      <w:rPr>
+        <w:rFonts w:ascii="Symbol" w:hAnsi="Symbol" w:hint="default"/>
+      </w:rPr>
+    </w:lvl>
+    <w:lvl w:ilvl="1" w:tplc="08090003" w:tentative="1">
+      <w:start w:val="1"/>
+      <w:numFmt w:val="bullet"/>
+      <w:lvlText w:val="o"/>
+      <w:lvlJc w:val="left"/>
+      <w:pPr>
+        <w:ind w:left="1440" w:hanging="360"/>
+      </w:pPr>
+      <w:rPr>
+        <w:rFonts w:ascii="Courier New" w:hAnsi="Courier New" w:cs="Courier New" w:hint="default"/>
+      </w:rPr>
+    </w:lvl>
+    <w:lvl w:ilvl="2" w:tplc="08090005" w:tentative="1">
+      <w:start w:val="1"/>
+      <w:numFmt w:val="bullet"/>
+      <w:lvlText w:val=""/>
+      <w:lvlJc w:val="left"/>
+      <w:pPr>
+        <w:ind w:left="2160" w:hanging="360"/>
+      </w:pPr>
+      <w:rPr>
+        <w:rFonts w:ascii="Wingdings" w:hAnsi="Wingdings" w:hint="default"/>
+      </w:rPr>
+    </w:lvl>
+    <w:lvl w:ilvl="3" w:tplc="08090001" w:tentative="1">
+      <w:start w:val="1"/>
+      <w:numFmt w:val="bullet"/>
+      <w:lvlText w:val=""/>
+      <w:lvlJc w:val="left"/>
+      <w:pPr>
+        <w:ind w:left="2880" w:hanging="360"/>
+      </w:pPr>
+      <w:rPr>
+        <w:rFonts w:ascii="Symbol" w:hAnsi="Symbol" w:hint="default"/>
+      </w:rPr>
+    </w:lvl>
+    <w:lvl w:ilvl="4" w:tplc="08090003" w:tentative="1">
+      <w:start w:val="1"/>
+      <w:numFmt w:val="bullet"/>
+      <w:lvlText w:val="o"/>
+      <w:lvlJc w:val="left"/>
+      <w:pPr>
+        <w:ind w:left="3600" w:hanging="360"/>
+      </w:pPr>
+      <w:rPr>
+        <w:rFonts w:ascii="Courier New" w:hAnsi="Courier New" w:cs="Courier New" w:hint="default"/>
+      </w:rPr>
+    </w:lvl>
+    <w:lvl w:ilvl="5" w:tplc="08090005" w:tentative="1">
+      <w:start w:val="1"/>
+      <w:numFmt w:val="bullet"/>
+      <w:lvlText w:val=""/>
+      <w:lvlJc w:val="left"/>
+      <w:pPr>
+        <w:ind w:left="4320" w:hanging="360"/>
+      </w:pPr>
+      <w:rPr>
+        <w:rFonts w:ascii="Wingdings" w:hAnsi="Wingdings" w:hint="default"/>
+      </w:rPr>
+    </w:lvl>
+    <w:lvl w:ilvl="6" w:tplc="08090001" w:tentative="1">
+      <w:start w:val="1"/>
+      <w:numFmt w:val="bullet"/>
+      <w:lvlText w:val=""/>
+      <w:lvlJc w:val="left"/>
+      <w:pPr>
+        <w:ind w:left="5040" w:hanging="360"/>
+      </w:pPr>
+      <w:rPr>
+        <w:rFonts w:ascii="Symbol" w:hAnsi="Symbol" w:hint="default"/>
+      </w:rPr>
+    </w:lvl>
+    <w:lvl w:ilvl="7" w:tplc="08090003" w:tentative="1">
+      <w:start w:val="1"/>
+      <w:numFmt w:val="bullet"/>
+      <w:lvlText w:val="o"/>
+      <w:lvlJc w:val="left"/>
+      <w:pPr>
+        <w:ind w:left="5760" w:hanging="360"/>
+      </w:pPr>
+      <w:rPr>
+        <w:rFonts w:ascii="Courier New" w:hAnsi="Courier New" w:cs="Courier New" w:hint="default"/>
+      </w:rPr>
+    </w:lvl>
+    <w:lvl w:ilvl="8" w:tplc="08090005" w:tentative="1">
+      <w:start w:val="1"/>
+      <w:numFmt w:val="bullet"/>
+      <w:lvlText w:val=""/>
+      <w:lvlJc w:val="left"/>
+      <w:pPr>
+        <w:ind w:left="6480" w:hanging="360"/>
+      </w:pPr>
+      <w:rPr>
+        <w:rFonts w:ascii="Wingdings" w:hAnsi="Wingdings" w:hint="default"/>
+      </w:rPr>
+    </w:lvl>
+  </w:abstractNum>
+  <w:abstractNum w:abstractNumId="6" w15:restartNumberingAfterBreak="0">
+    <w:nsid w:val="68362AFF"/>
+    <w:multiLevelType w:val="hybridMultilevel"/>
+    <w:tmpl w:val="4FA49EA8"/>
+    <w:lvl w:ilvl="0" w:tplc="08090001">
+      <w:start w:val="1"/>
+      <w:numFmt w:val="bullet"/>
+      <w:lvlText w:val=""/>
+      <w:lvlJc w:val="left"/>
+      <w:pPr>
+        <w:ind w:left="720" w:hanging="360"/>
+      </w:pPr>
+      <w:rPr>
+        <w:rFonts w:ascii="Symbol" w:hAnsi="Symbol" w:hint="default"/>
+      </w:rPr>
+    </w:lvl>
+    <w:lvl w:ilvl="1" w:tplc="08090003" w:tentative="1">
+      <w:start w:val="1"/>
+      <w:numFmt w:val="bullet"/>
+      <w:lvlText w:val="o"/>
+      <w:lvlJc w:val="left"/>
+      <w:pPr>
+        <w:ind w:left="1440" w:hanging="360"/>
+      </w:pPr>
+      <w:rPr>
+        <w:rFonts w:ascii="Courier New" w:hAnsi="Courier New" w:cs="Courier New" w:hint="default"/>
+      </w:rPr>
+    </w:lvl>
+    <w:lvl w:ilvl="2" w:tplc="08090005" w:tentative="1">
+      <w:start w:val="1"/>
+      <w:numFmt w:val="bullet"/>
+      <w:lvlText w:val=""/>
+      <w:lvlJc w:val="left"/>
+      <w:pPr>
+        <w:ind w:left="2160" w:hanging="360"/>
+      </w:pPr>
+      <w:rPr>
+        <w:rFonts w:ascii="Wingdings" w:hAnsi="Wingdings" w:hint="default"/>
+      </w:rPr>
+    </w:lvl>
+    <w:lvl w:ilvl="3" w:tplc="08090001" w:tentative="1">
+      <w:start w:val="1"/>
+      <w:numFmt w:val="bullet"/>
+      <w:lvlText w:val=""/>
+      <w:lvlJc w:val="left"/>
+      <w:pPr>
+        <w:ind w:left="2880" w:hanging="360"/>
+      </w:pPr>
+      <w:rPr>
+        <w:rFonts w:ascii="Symbol" w:hAnsi="Symbol" w:hint="default"/>
+      </w:rPr>
+    </w:lvl>
+    <w:lvl w:ilvl="4" w:tplc="08090003" w:tentative="1">
+      <w:start w:val="1"/>
+      <w:numFmt w:val="bullet"/>
+      <w:lvlText w:val="o"/>
+      <w:lvlJc w:val="left"/>
+      <w:pPr>
+        <w:ind w:left="3600" w:hanging="360"/>
+      </w:pPr>
+      <w:rPr>
+        <w:rFonts w:ascii="Courier New" w:hAnsi="Courier New" w:cs="Courier New" w:hint="default"/>
+      </w:rPr>
+    </w:lvl>
+    <w:lvl w:ilvl="5" w:tplc="08090005" w:tentative="1">
+      <w:start w:val="1"/>
+      <w:numFmt w:val="bullet"/>
+      <w:lvlText w:val=""/>
+      <w:lvlJc w:val="left"/>
+      <w:pPr>
+        <w:ind w:left="4320" w:hanging="360"/>
+      </w:pPr>
+      <w:rPr>
+        <w:rFonts w:ascii="Wingdings" w:hAnsi="Wingdings" w:hint="default"/>
+      </w:rPr>
+    </w:lvl>
+    <w:lvl w:ilvl="6" w:tplc="08090001" w:tentative="1">
+      <w:start w:val="1"/>
+      <w:numFmt w:val="bullet"/>
+      <w:lvlText w:val=""/>
+      <w:lvlJc w:val="left"/>
+      <w:pPr>
+        <w:ind w:left="5040" w:hanging="360"/>
+      </w:pPr>
+      <w:rPr>
+        <w:rFonts w:ascii="Symbol" w:hAnsi="Symbol" w:hint="default"/>
+      </w:rPr>
+    </w:lvl>
+    <w:lvl w:ilvl="7" w:tplc="08090003" w:tentative="1">
+      <w:start w:val="1"/>
+      <w:numFmt w:val="bullet"/>
+      <w:lvlText w:val="o"/>
+      <w:lvlJc w:val="left"/>
+      <w:pPr>
+        <w:ind w:left="5760" w:hanging="360"/>
+      </w:pPr>
+      <w:rPr>
+        <w:rFonts w:ascii="Courier New" w:hAnsi="Courier New" w:cs="Courier New" w:hint="default"/>
+      </w:rPr>
+    </w:lvl>
+    <w:lvl w:ilvl="8" w:tplc="08090005" w:tentative="1">
+      <w:start w:val="1"/>
+      <w:numFmt w:val="bullet"/>
+      <w:lvlText w:val=""/>
+      <w:lvlJc w:val="left"/>
+      <w:pPr>
+        <w:ind w:left="6480" w:hanging="360"/>
+      </w:pPr>
+      <w:rPr>
+        <w:rFonts w:ascii="Wingdings" w:hAnsi="Wingdings" w:hint="default"/>
+      </w:rPr>
+    </w:lvl>
+  </w:abstractNum>
+  <w:abstractNum w:abstractNumId="7" w15:restartNumberingAfterBreak="0">
+    <w:nsid w:val="718F390C"/>
+    <w:multiLevelType w:val="hybridMultilevel"/>
+    <w:tmpl w:val="7B6E996C"/>
+    <w:lvl w:ilvl="0" w:tplc="08090001">
+      <w:start w:val="1"/>
+      <w:numFmt w:val="bullet"/>
+      <w:lvlText w:val=""/>
+      <w:lvlJc w:val="left"/>
+      <w:pPr>
+        <w:ind w:left="720" w:hanging="360"/>
+      </w:pPr>
+      <w:rPr>
+        <w:rFonts w:ascii="Symbol" w:hAnsi="Symbol" w:hint="default"/>
+      </w:rPr>
+    </w:lvl>
+    <w:lvl w:ilvl="1" w:tplc="08090003" w:tentative="1">
+      <w:start w:val="1"/>
+      <w:numFmt w:val="bullet"/>
+      <w:lvlText w:val="o"/>
+      <w:lvlJc w:val="left"/>
+      <w:pPr>
+        <w:ind w:left="1440" w:hanging="360"/>
+      </w:pPr>
+      <w:rPr>
+        <w:rFonts w:ascii="Courier New" w:hAnsi="Courier New" w:cs="Courier New" w:hint="default"/>
+      </w:rPr>
+    </w:lvl>
+    <w:lvl w:ilvl="2" w:tplc="08090005" w:tentative="1">
+      <w:start w:val="1"/>
+      <w:numFmt w:val="bullet"/>
+      <w:lvlText w:val=""/>
+      <w:lvlJc w:val="left"/>
+      <w:pPr>
+        <w:ind w:left="2160" w:hanging="360"/>
+      </w:pPr>
+      <w:rPr>
+        <w:rFonts w:ascii="Wingdings" w:hAnsi="Wingdings" w:hint="default"/>
+      </w:rPr>
+    </w:lvl>
+    <w:lvl w:ilvl="3" w:tplc="08090001" w:tentative="1">
+      <w:start w:val="1"/>
+      <w:numFmt w:val="bullet"/>
+      <w:lvlText w:val=""/>
+      <w:lvlJc w:val="left"/>
+      <w:pPr>
+        <w:ind w:left="2880" w:hanging="360"/>
+      </w:pPr>
+      <w:rPr>
+        <w:rFonts w:ascii="Symbol" w:hAnsi="Symbol" w:hint="default"/>
+      </w:rPr>
+    </w:lvl>
+    <w:lvl w:ilvl="4" w:tplc="08090003" w:tentative="1">
+      <w:start w:val="1"/>
+      <w:numFmt w:val="bullet"/>
+      <w:lvlText w:val="o"/>
+      <w:lvlJc w:val="left"/>
+      <w:pPr>
+        <w:ind w:left="3600" w:hanging="360"/>
+      </w:pPr>
+      <w:rPr>
+        <w:rFonts w:ascii="Courier New" w:hAnsi="Courier New" w:cs="Courier New" w:hint="default"/>
+      </w:rPr>
+    </w:lvl>
+    <w:lvl w:ilvl="5" w:tplc="08090005" w:tentative="1">
+      <w:start w:val="1"/>
+      <w:numFmt w:val="bullet"/>
+      <w:lvlText w:val=""/>
+      <w:lvlJc w:val="left"/>
+      <w:pPr>
+        <w:ind w:left="4320" w:hanging="360"/>
+      </w:pPr>
+      <w:rPr>
+        <w:rFonts w:ascii="Wingdings" w:hAnsi="Wingdings" w:hint="default"/>
+      </w:rPr>
+    </w:lvl>
+    <w:lvl w:ilvl="6" w:tplc="08090001" w:tentative="1">
+      <w:start w:val="1"/>
+      <w:numFmt w:val="bullet"/>
+      <w:lvlText w:val=""/>
+      <w:lvlJc w:val="left"/>
+      <w:pPr>
+        <w:ind w:left="5040" w:hanging="360"/>
+      </w:pPr>
+      <w:rPr>
+        <w:rFonts w:ascii="Symbol" w:hAnsi="Symbol" w:hint="default"/>
+      </w:rPr>
+    </w:lvl>
+    <w:lvl w:ilvl="7" w:tplc="08090003" w:tentative="1">
+      <w:start w:val="1"/>
+      <w:numFmt w:val="bullet"/>
+      <w:lvlText w:val="o"/>
+      <w:lvlJc w:val="left"/>
+      <w:pPr>
+        <w:ind w:left="5760" w:hanging="360"/>
+      </w:pPr>
+      <w:rPr>
+        <w:rFonts w:ascii="Courier New" w:hAnsi="Courier New" w:cs="Courier New" w:hint="default"/>
+      </w:rPr>
+    </w:lvl>
+    <w:lvl w:ilvl="8" w:tplc="08090005" w:tentative="1">
+      <w:start w:val="1"/>
+      <w:numFmt w:val="bullet"/>
+      <w:lvlText w:val=""/>
+      <w:lvlJc w:val="left"/>
+      <w:pPr>
+        <w:ind w:left="6480" w:hanging="360"/>
+      </w:pPr>
+      <w:rPr>
+        <w:rFonts w:ascii="Wingdings" w:hAnsi="Wingdings" w:hint="default"/>
+      </w:rPr>
+    </w:lvl>
+  </w:abstractNum>
   <w:num w:numId="1">
     <w:abstractNumId w:val="1"/>
   </w:num>
   <w:num w:numId="2">
     <w:abstractNumId w:val="0"/>
+  </w:num>
+  <w:num w:numId="3">
+    <w:abstractNumId w:val="2"/>
+  </w:num>
+  <w:num w:numId="4">
+    <w:abstractNumId w:val="3"/>
+  </w:num>
+  <w:num w:numId="5">
+    <w:abstractNumId w:val="5"/>
+  </w:num>
+  <w:num w:numId="6">
+    <w:abstractNumId w:val="6"/>
+  </w:num>
+  <w:num w:numId="7">
+    <w:abstractNumId w:val="7"/>
+  </w:num>
+  <w:num w:numId="8">
+    <w:abstractNumId w:val="4"/>
   </w:num>
 </w:numbering>
 </file>
@@ -881,11 +1755,7 @@
         <w:lang w:val="en-GB" w:eastAsia="en-US" w:bidi="ar-SA"/>
       </w:rPr>
     </w:rPrDefault>
-    <w:pPrDefault>
-      <w:pPr>
-        <w:spacing w:after="160" w:line="259" w:lineRule="auto"/>
-      </w:pPr>
-    </w:pPrDefault>
+    <w:pPrDefault/>
   </w:docDefaults>
   <w:latentStyles w:defLockedState="0" w:defUIPriority="99" w:defSemiHidden="0" w:defUnhideWhenUsed="0" w:defQFormat="0" w:count="375">
     <w:lsdException w:name="Normal" w:uiPriority="0" w:qFormat="1"/>
@@ -1306,6 +2176,23 @@
       <w:contextualSpacing/>
     </w:pPr>
   </w:style>
+  <w:style w:type="paragraph" w:styleId="NormalWeb">
+    <w:name w:val="Normal (Web)"/>
+    <w:basedOn w:val="Normal"/>
+    <w:uiPriority w:val="99"/>
+    <w:semiHidden/>
+    <w:unhideWhenUsed/>
+    <w:rsid w:val="00A61FA5"/>
+    <w:pPr>
+      <w:spacing w:before="100" w:beforeAutospacing="1" w:after="100" w:afterAutospacing="1"/>
+    </w:pPr>
+    <w:rPr>
+      <w:rFonts w:ascii="Times New Roman" w:eastAsia="Times New Roman" w:hAnsi="Times New Roman" w:cs="Times New Roman"/>
+      <w:sz w:val="24"/>
+      <w:szCs w:val="24"/>
+      <w:lang w:eastAsia="en-GB"/>
+    </w:rPr>
+  </w:style>
 </w:styles>
 </file>
 

</xml_diff>

<commit_message>
Pause play, restart and Exit implemented
game is broken, timer and pause button along with win checks are not working
</commit_message>
<xml_diff>
--- a/Sumo Game Update.docx
+++ b/Sumo Game Update.docx
@@ -798,6 +798,92 @@
         </w:rPr>
         <w:t xml:space="preserve">. </w:t>
       </w:r>
+      <w:r>
+        <w:rPr>
+          <w:rFonts w:asciiTheme="minorHAnsi" w:hAnsiTheme="minorHAnsi" w:cstheme="minorHAnsi"/>
+          <w:sz w:val="22"/>
+          <w:szCs w:val="22"/>
+        </w:rPr>
+        <w:br/>
+      </w:r>
+      <w:r>
+        <w:rPr>
+          <w:rFonts w:asciiTheme="minorHAnsi" w:hAnsiTheme="minorHAnsi" w:cstheme="minorHAnsi"/>
+          <w:sz w:val="22"/>
+          <w:szCs w:val="22"/>
+        </w:rPr>
+        <w:br/>
+        <w:t>Update 11</w:t>
+      </w:r>
+      <w:r>
+        <w:rPr>
+          <w:rFonts w:asciiTheme="minorHAnsi" w:hAnsiTheme="minorHAnsi" w:cstheme="minorHAnsi"/>
+          <w:sz w:val="22"/>
+          <w:szCs w:val="22"/>
+        </w:rPr>
+        <w:br/>
+        <w:t>above mentioned is fixed. Now also the UI is disabled when the players announcement screen is active. Now I will work on the pause/play, reset, and exit to home buttons.</w:t>
+      </w:r>
+    </w:p>
+    <w:p>
+      <w:pPr>
+        <w:pStyle w:val="NormalWeb"/>
+        <w:spacing w:before="0" w:beforeAutospacing="0" w:after="0" w:afterAutospacing="0"/>
+        <w:rPr>
+          <w:rFonts w:asciiTheme="minorHAnsi" w:hAnsiTheme="minorHAnsi" w:cstheme="minorHAnsi"/>
+          <w:sz w:val="22"/>
+          <w:szCs w:val="22"/>
+        </w:rPr>
+      </w:pPr>
+    </w:p>
+    <w:p>
+      <w:pPr>
+        <w:pStyle w:val="NormalWeb"/>
+        <w:spacing w:before="0" w:beforeAutospacing="0" w:after="0" w:afterAutospacing="0"/>
+        <w:rPr>
+          <w:rFonts w:asciiTheme="minorHAnsi" w:hAnsiTheme="minorHAnsi" w:cstheme="minorHAnsi"/>
+          <w:sz w:val="22"/>
+          <w:szCs w:val="22"/>
+        </w:rPr>
+      </w:pPr>
+      <w:r>
+        <w:rPr>
+          <w:rFonts w:asciiTheme="minorHAnsi" w:hAnsiTheme="minorHAnsi" w:cstheme="minorHAnsi"/>
+          <w:sz w:val="22"/>
+          <w:szCs w:val="22"/>
+        </w:rPr>
+        <w:t>Update 12</w:t>
+      </w:r>
+    </w:p>
+    <w:p>
+      <w:pPr>
+        <w:pStyle w:val="NormalWeb"/>
+        <w:spacing w:before="0" w:beforeAutospacing="0" w:after="0" w:afterAutospacing="0"/>
+        <w:rPr>
+          <w:rFonts w:asciiTheme="minorHAnsi" w:hAnsiTheme="minorHAnsi" w:cstheme="minorHAnsi"/>
+          <w:sz w:val="22"/>
+          <w:szCs w:val="22"/>
+        </w:rPr>
+      </w:pPr>
+      <w:r>
+        <w:rPr>
+          <w:rFonts w:asciiTheme="minorHAnsi" w:hAnsiTheme="minorHAnsi" w:cstheme="minorHAnsi"/>
+          <w:sz w:val="22"/>
+          <w:szCs w:val="22"/>
+        </w:rPr>
+        <w:t>Pause/play, restart and exit buttons are enables but now the game is broken after pressing pause then play. Also restart goes to game mode instead of restarting the current game mode completely.</w:t>
+      </w:r>
+    </w:p>
+    <w:p>
+      <w:pPr>
+        <w:pStyle w:val="NormalWeb"/>
+        <w:spacing w:before="0" w:beforeAutospacing="0" w:after="0" w:afterAutospacing="0"/>
+        <w:rPr>
+          <w:rFonts w:asciiTheme="minorHAnsi" w:hAnsiTheme="minorHAnsi" w:cstheme="minorHAnsi"/>
+          <w:sz w:val="22"/>
+          <w:szCs w:val="22"/>
+        </w:rPr>
+      </w:pPr>
       <w:bookmarkStart w:id="0" w:name="_GoBack"/>
       <w:bookmarkEnd w:id="0"/>
     </w:p>

</xml_diff>

<commit_message>
Added some player art and audio for the game
Added:
-Music
-Player art
Changed:
-Game manager
-Top down code
</commit_message>
<xml_diff>
--- a/Sumo Game Update.docx
+++ b/Sumo Game Update.docx
@@ -872,6 +872,88 @@
           <w:szCs w:val="22"/>
         </w:rPr>
         <w:t>Pause/play, restart and exit buttons are enables but now the game is broken after pressing pause then play. Also restart goes to game mode instead of restarting the current game mode completely.</w:t>
+      </w:r>
+      <w:r>
+        <w:rPr>
+          <w:rFonts w:asciiTheme="minorHAnsi" w:hAnsiTheme="minorHAnsi" w:cstheme="minorHAnsi"/>
+          <w:sz w:val="22"/>
+          <w:szCs w:val="22"/>
+        </w:rPr>
+        <w:br/>
+      </w:r>
+      <w:r>
+        <w:rPr>
+          <w:rFonts w:asciiTheme="minorHAnsi" w:hAnsiTheme="minorHAnsi" w:cstheme="minorHAnsi"/>
+          <w:sz w:val="22"/>
+          <w:szCs w:val="22"/>
+        </w:rPr>
+        <w:br/>
+        <w:t>Update 13</w:t>
+      </w:r>
+      <w:r>
+        <w:rPr>
+          <w:rFonts w:asciiTheme="minorHAnsi" w:hAnsiTheme="minorHAnsi" w:cstheme="minorHAnsi"/>
+          <w:sz w:val="22"/>
+          <w:szCs w:val="22"/>
+        </w:rPr>
+        <w:br/>
+        <w:t xml:space="preserve">Pause/Play is finally active. I messed up the script for the pause manager that’s why the game doesn’t resume after the play button is pressed. the game control UI is now swapped out for different place </w:t>
+      </w:r>
+      <w:r>
+        <w:rPr>
+          <w:rFonts w:asciiTheme="minorHAnsi" w:hAnsiTheme="minorHAnsi" w:cstheme="minorHAnsi"/>
+          <w:sz w:val="22"/>
+          <w:szCs w:val="22"/>
+        </w:rPr>
+        <w:t>f</w:t>
+      </w:r>
+      <w:r>
+        <w:rPr>
+          <w:rFonts w:asciiTheme="minorHAnsi" w:hAnsiTheme="minorHAnsi" w:cstheme="minorHAnsi"/>
+          <w:sz w:val="22"/>
+          <w:szCs w:val="22"/>
+        </w:rPr>
+        <w:t>olders for now be</w:t>
+      </w:r>
+      <w:r>
+        <w:rPr>
+          <w:rFonts w:asciiTheme="minorHAnsi" w:hAnsiTheme="minorHAnsi" w:cstheme="minorHAnsi"/>
+          <w:sz w:val="22"/>
+          <w:szCs w:val="22"/>
+        </w:rPr>
+        <w:t>c</w:t>
+      </w:r>
+      <w:r>
+        <w:rPr>
+          <w:rFonts w:asciiTheme="minorHAnsi" w:hAnsiTheme="minorHAnsi" w:cstheme="minorHAnsi"/>
+          <w:sz w:val="22"/>
+          <w:szCs w:val="22"/>
+        </w:rPr>
+        <w:t>ause I didn’t like the way the square</w:t>
+      </w:r>
+      <w:r>
+        <w:rPr>
+          <w:rFonts w:asciiTheme="minorHAnsi" w:hAnsiTheme="minorHAnsi" w:cstheme="minorHAnsi"/>
+          <w:sz w:val="22"/>
+          <w:szCs w:val="22"/>
+        </w:rPr>
+        <w:t>s</w:t>
+      </w:r>
+      <w:r>
+        <w:rPr>
+          <w:rFonts w:asciiTheme="minorHAnsi" w:hAnsiTheme="minorHAnsi" w:cstheme="minorHAnsi"/>
+          <w:sz w:val="22"/>
+          <w:szCs w:val="22"/>
+        </w:rPr>
+        <w:t xml:space="preserve"> looked</w:t>
+      </w:r>
+      <w:r>
+        <w:rPr>
+          <w:rFonts w:asciiTheme="minorHAnsi" w:hAnsiTheme="minorHAnsi" w:cstheme="minorHAnsi"/>
+          <w:sz w:val="22"/>
+          <w:szCs w:val="22"/>
+        </w:rPr>
+        <w:t xml:space="preserve">. </w:t>
       </w:r>
     </w:p>
     <w:p>

</xml_diff>